<commit_message>
Doku fertig und Pdf für Herr Dieringer
</commit_message>
<xml_diff>
--- a/documentation/Ritnalap.docx
+++ b/documentation/Ritnalap.docx
@@ -12,16 +12,50 @@
           <w:szCs w:val="48"/>
         </w:rPr>
       </w:pPr>
+      <w:proofErr w:type="gramStart"/>
       <w:r>
         <w:rPr>
           <w:rFonts w:ascii="Bahnschrift Light" w:hAnsi="Bahnschrift Light"/>
           <w:sz w:val="48"/>
           <w:szCs w:val="48"/>
         </w:rPr>
-        <w:t xml:space="preserve">Ritnalap  - Alarmanlage mit LCD Anzeige </w:t>
-      </w:r>
-    </w:p>
-    <w:p/>
+        <w:t>Ritnalap  -</w:t>
+      </w:r>
+      <w:proofErr w:type="gramEnd"/>
+      <w:r>
+        <w:rPr>
+          <w:rFonts w:ascii="Bahnschrift Light" w:hAnsi="Bahnschrift Light"/>
+          <w:sz w:val="48"/>
+          <w:szCs w:val="48"/>
+        </w:rPr>
+        <w:t xml:space="preserve"> Alarmanlage mit </w:t>
+      </w:r>
+      <w:proofErr w:type="gramStart"/>
+      <w:r>
+        <w:rPr>
+          <w:rFonts w:ascii="Bahnschrift Light" w:hAnsi="Bahnschrift Light"/>
+          <w:sz w:val="48"/>
+          <w:szCs w:val="48"/>
+        </w:rPr>
+        <w:t>LCD Anzeige</w:t>
+      </w:r>
+      <w:proofErr w:type="gramEnd"/>
+      <w:r>
+        <w:rPr>
+          <w:rFonts w:ascii="Bahnschrift Light" w:hAnsi="Bahnschrift Light"/>
+          <w:sz w:val="48"/>
+          <w:szCs w:val="48"/>
+        </w:rPr>
+        <w:t xml:space="preserve"> </w:t>
+      </w:r>
+    </w:p>
+    <w:p>
+      <w:pPr>
+        <w:rPr>
+          <w:rFonts w:ascii="Bahnschrift Light" w:hAnsi="Bahnschrift Light"/>
+        </w:rPr>
+      </w:pPr>
+    </w:p>
     <w:p>
       <w:pPr>
         <w:pStyle w:val="KeinLeerraum"/>
@@ -37,11 +71,29 @@
         <w:t>Von Maximilian Kerskes und Johannes Schambortzki</w:t>
       </w:r>
     </w:p>
-    <w:p/>
-    <w:p/>
-    <w:p>
-      <w:r>
-        <w:rPr>
+    <w:p>
+      <w:pPr>
+        <w:rPr>
+          <w:rFonts w:ascii="Bahnschrift Light" w:hAnsi="Bahnschrift Light"/>
+        </w:rPr>
+      </w:pPr>
+    </w:p>
+    <w:p>
+      <w:pPr>
+        <w:rPr>
+          <w:rFonts w:ascii="Bahnschrift Light" w:hAnsi="Bahnschrift Light"/>
+        </w:rPr>
+      </w:pPr>
+    </w:p>
+    <w:p>
+      <w:pPr>
+        <w:rPr>
+          <w:rFonts w:ascii="Bahnschrift Light" w:hAnsi="Bahnschrift Light"/>
+        </w:rPr>
+      </w:pPr>
+      <w:r>
+        <w:rPr>
+          <w:rFonts w:ascii="Bahnschrift Light" w:hAnsi="Bahnschrift Light"/>
           <w:noProof/>
         </w:rPr>
         <w:drawing>
@@ -62,7 +114,7 @@
                     </pic:cNvPicPr>
                   </pic:nvPicPr>
                   <pic:blipFill>
-                    <a:blip r:embed="rId4">
+                    <a:blip r:embed="rId5">
                       <a:extLst>
                         <a:ext uri="{28A0092B-C50C-407E-A947-70E740481C1C}">
                           <a14:useLocalDpi xmlns:a14="http://schemas.microsoft.com/office/drawing/2010/main" val="0"/>
@@ -94,197 +146,1263 @@
         </w:drawing>
       </w:r>
     </w:p>
-    <w:p/>
-    <w:p/>
-    <w:p/>
-    <w:p/>
-    <w:p/>
-    <w:p/>
-    <w:p/>
-    <w:p/>
-    <w:p/>
-    <w:p/>
-    <w:p>
-      <w:r>
+    <w:p>
+      <w:pPr>
+        <w:rPr>
+          <w:rFonts w:ascii="Bahnschrift Light" w:hAnsi="Bahnschrift Light"/>
+        </w:rPr>
+      </w:pPr>
+    </w:p>
+    <w:p>
+      <w:pPr>
+        <w:rPr>
+          <w:rFonts w:ascii="Bahnschrift Light" w:hAnsi="Bahnschrift Light"/>
+        </w:rPr>
+      </w:pPr>
+    </w:p>
+    <w:p>
+      <w:pPr>
+        <w:rPr>
+          <w:rFonts w:ascii="Bahnschrift Light" w:hAnsi="Bahnschrift Light"/>
+        </w:rPr>
+      </w:pPr>
+    </w:p>
+    <w:p>
+      <w:pPr>
+        <w:rPr>
+          <w:rFonts w:ascii="Bahnschrift Light" w:hAnsi="Bahnschrift Light"/>
+        </w:rPr>
+      </w:pPr>
+    </w:p>
+    <w:p>
+      <w:pPr>
+        <w:rPr>
+          <w:rFonts w:ascii="Bahnschrift Light" w:hAnsi="Bahnschrift Light"/>
+        </w:rPr>
+      </w:pPr>
+    </w:p>
+    <w:p>
+      <w:pPr>
+        <w:rPr>
+          <w:rFonts w:ascii="Bahnschrift Light" w:hAnsi="Bahnschrift Light"/>
+        </w:rPr>
+      </w:pPr>
+    </w:p>
+    <w:p>
+      <w:pPr>
+        <w:rPr>
+          <w:rFonts w:ascii="Bahnschrift Light" w:hAnsi="Bahnschrift Light"/>
+        </w:rPr>
+      </w:pPr>
+    </w:p>
+    <w:p>
+      <w:pPr>
+        <w:rPr>
+          <w:rFonts w:ascii="Bahnschrift Light" w:hAnsi="Bahnschrift Light"/>
+        </w:rPr>
+      </w:pPr>
+    </w:p>
+    <w:p>
+      <w:pPr>
+        <w:rPr>
+          <w:rFonts w:ascii="Bahnschrift Light" w:hAnsi="Bahnschrift Light"/>
+        </w:rPr>
+      </w:pPr>
+    </w:p>
+    <w:p>
+      <w:pPr>
+        <w:rPr>
+          <w:rFonts w:ascii="Bahnschrift Light" w:hAnsi="Bahnschrift Light"/>
+        </w:rPr>
+      </w:pPr>
+    </w:p>
+    <w:p>
+      <w:pPr>
+        <w:pStyle w:val="berschrift2"/>
+        <w:rPr>
+          <w:rFonts w:ascii="Bahnschrift Light" w:hAnsi="Bahnschrift Light"/>
+        </w:rPr>
+      </w:pPr>
+      <w:r>
+        <w:rPr>
+          <w:rFonts w:ascii="Bahnschrift Light" w:hAnsi="Bahnschrift Light"/>
+        </w:rPr>
         <w:lastRenderedPageBreak/>
-        <w:t xml:space="preserve">Verwendete Module: </w:t>
-      </w:r>
-      <w:r>
-        <w:t>PIR</w:t>
-      </w:r>
-      <w:r>
-        <w:t>-Sensor, LED-Button, Buzzer, LCD-Screen</w:t>
-      </w:r>
-    </w:p>
-    <w:p>
-      <w:r>
-        <w:t>Projektidee: Ritnalap, Alarmanlage mit LCD-Anzeige</w:t>
-      </w:r>
-    </w:p>
-    <w:p>
-      <w:r>
-        <w:t xml:space="preserve">Projektziel: Alarmanlage, welche auf Bewegung </w:t>
-      </w:r>
-      <w:r>
+        <w:t>Lastenheft</w:t>
+      </w:r>
+    </w:p>
+    <w:p>
+      <w:pPr>
+        <w:rPr>
+          <w:rFonts w:ascii="Bahnschrift Light" w:hAnsi="Bahnschrift Light"/>
+        </w:rPr>
+      </w:pPr>
+      <w:r>
+        <w:rPr>
+          <w:rFonts w:ascii="Bahnschrift Light" w:hAnsi="Bahnschrift Light"/>
+          <w:b/>
+          <w:bCs/>
+        </w:rPr>
+        <w:t>Verwendete Module</w:t>
+      </w:r>
+      <w:r>
+        <w:rPr>
+          <w:rFonts w:ascii="Bahnschrift Light" w:hAnsi="Bahnschrift Light"/>
+        </w:rPr>
+        <w:t>:</w:t>
+      </w:r>
+    </w:p>
+    <w:p>
+      <w:pPr>
+        <w:rPr>
+          <w:rFonts w:ascii="Bahnschrift Light" w:hAnsi="Bahnschrift Light"/>
+        </w:rPr>
+      </w:pPr>
+      <w:r>
+        <w:rPr>
+          <w:rFonts w:ascii="Bahnschrift Light" w:hAnsi="Bahnschrift Light"/>
+        </w:rPr>
+        <w:t>Motion-</w:t>
+      </w:r>
+      <w:r>
+        <w:rPr>
+          <w:rFonts w:ascii="Bahnschrift Light" w:hAnsi="Bahnschrift Light"/>
+        </w:rPr>
+        <w:t>Sensor</w:t>
+      </w:r>
+      <w:r>
+        <w:rPr>
+          <w:rFonts w:ascii="Bahnschrift Light" w:hAnsi="Bahnschrift Light"/>
+        </w:rPr>
+        <w:t xml:space="preserve">     LED-Button          Buzzer                              LCD</w:t>
+      </w:r>
+    </w:p>
+    <w:p>
+      <w:pPr>
+        <w:rPr>
+          <w:rFonts w:ascii="Bahnschrift Light" w:hAnsi="Bahnschrift Light"/>
+        </w:rPr>
+      </w:pPr>
+      <w:r>
+        <w:rPr>
+          <w:rFonts w:ascii="Bahnschrift Light" w:hAnsi="Bahnschrift Light"/>
+          <w:noProof/>
+        </w:rPr>
+        <w:drawing>
+          <wp:inline distT="0" distB="0" distL="0" distR="0" wp14:anchorId="2B191D9B" wp14:editId="69A1EE73">
+            <wp:extent cx="1081854" cy="811033"/>
+            <wp:effectExtent l="0" t="0" r="4445" b="8255"/>
+            <wp:docPr id="1778312350" name="Grafik 1"/>
+            <wp:cNvGraphicFramePr>
+              <a:graphicFrameLocks xmlns:a="http://schemas.openxmlformats.org/drawingml/2006/main" noChangeAspect="1"/>
+            </wp:cNvGraphicFramePr>
+            <a:graphic xmlns:a="http://schemas.openxmlformats.org/drawingml/2006/main">
+              <a:graphicData uri="http://schemas.openxmlformats.org/drawingml/2006/picture">
+                <pic:pic xmlns:pic="http://schemas.openxmlformats.org/drawingml/2006/picture">
+                  <pic:nvPicPr>
+                    <pic:cNvPr id="0" name="Picture 1"/>
+                    <pic:cNvPicPr>
+                      <a:picLocks noChangeAspect="1" noChangeArrowheads="1"/>
+                    </pic:cNvPicPr>
+                  </pic:nvPicPr>
+                  <pic:blipFill>
+                    <a:blip r:embed="rId6" cstate="print">
+                      <a:extLst>
+                        <a:ext uri="{28A0092B-C50C-407E-A947-70E740481C1C}">
+                          <a14:useLocalDpi xmlns:a14="http://schemas.microsoft.com/office/drawing/2010/main" val="0"/>
+                        </a:ext>
+                      </a:extLst>
+                    </a:blip>
+                    <a:srcRect/>
+                    <a:stretch>
+                      <a:fillRect/>
+                    </a:stretch>
+                  </pic:blipFill>
+                  <pic:spPr bwMode="auto">
+                    <a:xfrm>
+                      <a:off x="0" y="0"/>
+                      <a:ext cx="1111342" cy="833139"/>
+                    </a:xfrm>
+                    <a:prstGeom prst="rect">
+                      <a:avLst/>
+                    </a:prstGeom>
+                    <a:noFill/>
+                    <a:ln>
+                      <a:noFill/>
+                    </a:ln>
+                  </pic:spPr>
+                </pic:pic>
+              </a:graphicData>
+            </a:graphic>
+          </wp:inline>
+        </w:drawing>
+      </w:r>
+      <w:r>
+        <w:rPr>
+          <w:rFonts w:ascii="Bahnschrift Light" w:hAnsi="Bahnschrift Light"/>
+        </w:rPr>
+        <w:t xml:space="preserve"> </w:t>
+      </w:r>
+      <w:r>
+        <w:rPr>
+          <w:rFonts w:ascii="Bahnschrift Light" w:hAnsi="Bahnschrift Light"/>
+          <w:noProof/>
+        </w:rPr>
+        <w:drawing>
+          <wp:inline distT="0" distB="0" distL="0" distR="0" wp14:anchorId="1AC4A2DF" wp14:editId="0D79CE39">
+            <wp:extent cx="1089329" cy="816756"/>
+            <wp:effectExtent l="0" t="0" r="0" b="2540"/>
+            <wp:docPr id="2046674364" name="Grafik 2"/>
+            <wp:cNvGraphicFramePr>
+              <a:graphicFrameLocks xmlns:a="http://schemas.openxmlformats.org/drawingml/2006/main" noChangeAspect="1"/>
+            </wp:cNvGraphicFramePr>
+            <a:graphic xmlns:a="http://schemas.openxmlformats.org/drawingml/2006/main">
+              <a:graphicData uri="http://schemas.openxmlformats.org/drawingml/2006/picture">
+                <pic:pic xmlns:pic="http://schemas.openxmlformats.org/drawingml/2006/picture">
+                  <pic:nvPicPr>
+                    <pic:cNvPr id="0" name="Picture 3"/>
+                    <pic:cNvPicPr>
+                      <a:picLocks noChangeAspect="1" noChangeArrowheads="1"/>
+                    </pic:cNvPicPr>
+                  </pic:nvPicPr>
+                  <pic:blipFill>
+                    <a:blip r:embed="rId7" cstate="print">
+                      <a:extLst>
+                        <a:ext uri="{28A0092B-C50C-407E-A947-70E740481C1C}">
+                          <a14:useLocalDpi xmlns:a14="http://schemas.microsoft.com/office/drawing/2010/main" val="0"/>
+                        </a:ext>
+                      </a:extLst>
+                    </a:blip>
+                    <a:srcRect/>
+                    <a:stretch>
+                      <a:fillRect/>
+                    </a:stretch>
+                  </pic:blipFill>
+                  <pic:spPr bwMode="auto">
+                    <a:xfrm flipV="1">
+                      <a:off x="0" y="0"/>
+                      <a:ext cx="1119419" cy="839317"/>
+                    </a:xfrm>
+                    <a:prstGeom prst="rect">
+                      <a:avLst/>
+                    </a:prstGeom>
+                    <a:noFill/>
+                    <a:ln>
+                      <a:noFill/>
+                    </a:ln>
+                  </pic:spPr>
+                </pic:pic>
+              </a:graphicData>
+            </a:graphic>
+          </wp:inline>
+        </w:drawing>
+      </w:r>
+      <w:r>
+        <w:rPr>
+          <w:rFonts w:ascii="Bahnschrift Light" w:hAnsi="Bahnschrift Light"/>
+        </w:rPr>
+        <w:t xml:space="preserve"> </w:t>
+      </w:r>
+      <w:r>
+        <w:rPr>
+          <w:rFonts w:ascii="Bahnschrift Light" w:hAnsi="Bahnschrift Light"/>
+          <w:noProof/>
+        </w:rPr>
+        <w:drawing>
+          <wp:inline distT="0" distB="0" distL="0" distR="0" wp14:anchorId="1875706F" wp14:editId="3F07133D">
+            <wp:extent cx="1514246" cy="813540"/>
+            <wp:effectExtent l="0" t="0" r="0" b="5715"/>
+            <wp:docPr id="2109024110" name="Grafik 3"/>
+            <wp:cNvGraphicFramePr>
+              <a:graphicFrameLocks xmlns:a="http://schemas.openxmlformats.org/drawingml/2006/main" noChangeAspect="1"/>
+            </wp:cNvGraphicFramePr>
+            <a:graphic xmlns:a="http://schemas.openxmlformats.org/drawingml/2006/main">
+              <a:graphicData uri="http://schemas.openxmlformats.org/drawingml/2006/picture">
+                <pic:pic xmlns:pic="http://schemas.openxmlformats.org/drawingml/2006/picture">
+                  <pic:nvPicPr>
+                    <pic:cNvPr id="0" name="Picture 5"/>
+                    <pic:cNvPicPr>
+                      <a:picLocks noChangeAspect="1" noChangeArrowheads="1"/>
+                    </pic:cNvPicPr>
+                  </pic:nvPicPr>
+                  <pic:blipFill>
+                    <a:blip r:embed="rId8" cstate="print">
+                      <a:extLst>
+                        <a:ext uri="{28A0092B-C50C-407E-A947-70E740481C1C}">
+                          <a14:useLocalDpi xmlns:a14="http://schemas.microsoft.com/office/drawing/2010/main" val="0"/>
+                        </a:ext>
+                      </a:extLst>
+                    </a:blip>
+                    <a:srcRect/>
+                    <a:stretch>
+                      <a:fillRect/>
+                    </a:stretch>
+                  </pic:blipFill>
+                  <pic:spPr bwMode="auto">
+                    <a:xfrm flipH="1">
+                      <a:off x="0" y="0"/>
+                      <a:ext cx="1554263" cy="835039"/>
+                    </a:xfrm>
+                    <a:prstGeom prst="rect">
+                      <a:avLst/>
+                    </a:prstGeom>
+                    <a:noFill/>
+                    <a:ln>
+                      <a:noFill/>
+                    </a:ln>
+                  </pic:spPr>
+                </pic:pic>
+              </a:graphicData>
+            </a:graphic>
+          </wp:inline>
+        </w:drawing>
+      </w:r>
+      <w:r>
+        <w:rPr>
+          <w:rFonts w:ascii="Bahnschrift Light" w:hAnsi="Bahnschrift Light"/>
+        </w:rPr>
+        <w:t xml:space="preserve"> </w:t>
+      </w:r>
+      <w:r>
+        <w:rPr>
+          <w:rFonts w:ascii="Bahnschrift Light" w:hAnsi="Bahnschrift Light"/>
+          <w:noProof/>
+        </w:rPr>
+        <w:drawing>
+          <wp:inline distT="0" distB="0" distL="0" distR="0" wp14:anchorId="1CB52DBF" wp14:editId="2DB97696">
+            <wp:extent cx="1094108" cy="820460"/>
+            <wp:effectExtent l="0" t="0" r="0" b="0"/>
+            <wp:docPr id="1423969773" name="Grafik 5"/>
+            <wp:cNvGraphicFramePr>
+              <a:graphicFrameLocks xmlns:a="http://schemas.openxmlformats.org/drawingml/2006/main" noChangeAspect="1"/>
+            </wp:cNvGraphicFramePr>
+            <a:graphic xmlns:a="http://schemas.openxmlformats.org/drawingml/2006/main">
+              <a:graphicData uri="http://schemas.openxmlformats.org/drawingml/2006/picture">
+                <pic:pic xmlns:pic="http://schemas.openxmlformats.org/drawingml/2006/picture">
+                  <pic:nvPicPr>
+                    <pic:cNvPr id="0" name="Picture 12"/>
+                    <pic:cNvPicPr>
+                      <a:picLocks noChangeAspect="1" noChangeArrowheads="1"/>
+                    </pic:cNvPicPr>
+                  </pic:nvPicPr>
+                  <pic:blipFill>
+                    <a:blip r:embed="rId9" cstate="print">
+                      <a:extLst>
+                        <a:ext uri="{28A0092B-C50C-407E-A947-70E740481C1C}">
+                          <a14:useLocalDpi xmlns:a14="http://schemas.microsoft.com/office/drawing/2010/main" val="0"/>
+                        </a:ext>
+                      </a:extLst>
+                    </a:blip>
+                    <a:srcRect/>
+                    <a:stretch>
+                      <a:fillRect/>
+                    </a:stretch>
+                  </pic:blipFill>
+                  <pic:spPr bwMode="auto">
+                    <a:xfrm>
+                      <a:off x="0" y="0"/>
+                      <a:ext cx="1115730" cy="836674"/>
+                    </a:xfrm>
+                    <a:prstGeom prst="rect">
+                      <a:avLst/>
+                    </a:prstGeom>
+                    <a:noFill/>
+                    <a:ln>
+                      <a:noFill/>
+                    </a:ln>
+                  </pic:spPr>
+                </pic:pic>
+              </a:graphicData>
+            </a:graphic>
+          </wp:inline>
+        </w:drawing>
+      </w:r>
+    </w:p>
+    <w:p>
+      <w:pPr>
+        <w:rPr>
+          <w:rFonts w:ascii="Bahnschrift Light" w:hAnsi="Bahnschrift Light"/>
+        </w:rPr>
+      </w:pPr>
+      <w:r>
+        <w:rPr>
+          <w:rFonts w:ascii="Bahnschrift Light" w:hAnsi="Bahnschrift Light"/>
+          <w:b/>
+          <w:bCs/>
+        </w:rPr>
+        <w:t>Projektidee</w:t>
+      </w:r>
+      <w:r>
+        <w:rPr>
+          <w:rFonts w:ascii="Bahnschrift Light" w:hAnsi="Bahnschrift Light"/>
+        </w:rPr>
+        <w:t>: Ritnalap, Alarmanlage mit LCD-Anzeige</w:t>
+      </w:r>
+    </w:p>
+    <w:p>
+      <w:pPr>
+        <w:rPr>
+          <w:rFonts w:ascii="Bahnschrift Light" w:hAnsi="Bahnschrift Light"/>
+        </w:rPr>
+      </w:pPr>
+      <w:r>
+        <w:rPr>
+          <w:rFonts w:ascii="Bahnschrift Light" w:hAnsi="Bahnschrift Light"/>
+          <w:b/>
+          <w:bCs/>
+        </w:rPr>
+        <w:t>Projektziel</w:t>
+      </w:r>
+      <w:r>
+        <w:rPr>
+          <w:rFonts w:ascii="Bahnschrift Light" w:hAnsi="Bahnschrift Light"/>
+        </w:rPr>
+        <w:t xml:space="preserve">: Alarmanlage, welche auf Bewegung </w:t>
+      </w:r>
+      <w:r>
+        <w:rPr>
+          <w:rFonts w:ascii="Bahnschrift Light" w:hAnsi="Bahnschrift Light"/>
+        </w:rPr>
         <w:t xml:space="preserve">mithilfe </w:t>
       </w:r>
       <w:r>
+        <w:rPr>
+          <w:rFonts w:ascii="Bahnschrift Light" w:hAnsi="Bahnschrift Light"/>
+        </w:rPr>
         <w:t xml:space="preserve">des </w:t>
       </w:r>
       <w:r>
+        <w:rPr>
+          <w:rFonts w:ascii="Bahnschrift Light" w:hAnsi="Bahnschrift Light"/>
+        </w:rPr>
         <w:t>PIR-</w:t>
       </w:r>
       <w:r>
+        <w:rPr>
+          <w:rFonts w:ascii="Bahnschrift Light" w:hAnsi="Bahnschrift Light"/>
+        </w:rPr>
         <w:t>Sensors reagiert, einen Ton abspielt und den Zeitpunkt der Bewegung auf dem LCD-Screen anzeigt.</w:t>
       </w:r>
     </w:p>
     <w:p>
-      <w:r>
-        <w:t>Anforderungen:</w:t>
+      <w:pPr>
+        <w:rPr>
+          <w:rFonts w:ascii="Bahnschrift Light" w:hAnsi="Bahnschrift Light"/>
+        </w:rPr>
+      </w:pPr>
+      <w:r>
+        <w:rPr>
+          <w:rFonts w:ascii="Bahnschrift Light" w:hAnsi="Bahnschrift Light"/>
+          <w:b/>
+          <w:bCs/>
+        </w:rPr>
+        <w:t>Anforderungen</w:t>
+      </w:r>
+      <w:r>
+        <w:rPr>
+          <w:rFonts w:ascii="Bahnschrift Light" w:hAnsi="Bahnschrift Light"/>
+        </w:rPr>
+        <w:t>:</w:t>
       </w:r>
     </w:p>
     <w:p>
       <w:pPr>
         <w:ind w:firstLine="708"/>
-      </w:pPr>
-      <w:r>
-        <w:t xml:space="preserve"> -Erkennung von Bewegungen mittels PIR-Sensors</w:t>
+        <w:rPr>
+          <w:rFonts w:ascii="Bahnschrift Light" w:hAnsi="Bahnschrift Light"/>
+        </w:rPr>
+      </w:pPr>
+      <w:r>
+        <w:rPr>
+          <w:rFonts w:ascii="Bahnschrift Light" w:hAnsi="Bahnschrift Light"/>
+        </w:rPr>
+        <w:t>-Erkennung von Bewegungen mittels PIR-Sensors</w:t>
       </w:r>
     </w:p>
     <w:p>
       <w:pPr>
         <w:ind w:firstLine="708"/>
-      </w:pPr>
-      <w:r>
+        <w:rPr>
+          <w:rFonts w:ascii="Bahnschrift Light" w:hAnsi="Bahnschrift Light"/>
+        </w:rPr>
+      </w:pPr>
+      <w:r>
+        <w:rPr>
+          <w:rFonts w:ascii="Bahnschrift Light" w:hAnsi="Bahnschrift Light"/>
+        </w:rPr>
         <w:t>-Akustisches Signal bei Bewegung mit Buzzer</w:t>
       </w:r>
     </w:p>
     <w:p>
       <w:pPr>
         <w:ind w:firstLine="708"/>
-      </w:pPr>
-      <w:r>
+        <w:rPr>
+          <w:rFonts w:ascii="Bahnschrift Light" w:hAnsi="Bahnschrift Light"/>
+        </w:rPr>
+      </w:pPr>
+      <w:r>
+        <w:rPr>
+          <w:rFonts w:ascii="Bahnschrift Light" w:hAnsi="Bahnschrift Light"/>
+        </w:rPr>
         <w:t>-Anzeige von Uhrzeit der Bewegung auf LCD-Screen</w:t>
       </w:r>
     </w:p>
     <w:p>
       <w:pPr>
         <w:ind w:firstLine="708"/>
-      </w:pPr>
-      <w:r>
-        <w:t>-Reset der Alarmanlage, wenn Button 1x gedrückt wird</w:t>
+        <w:rPr>
+          <w:rFonts w:ascii="Bahnschrift Light" w:hAnsi="Bahnschrift Light"/>
+        </w:rPr>
+      </w:pPr>
+      <w:r>
+        <w:rPr>
+          <w:rFonts w:ascii="Bahnschrift Light" w:hAnsi="Bahnschrift Light"/>
+        </w:rPr>
+        <w:t>-</w:t>
+      </w:r>
+      <w:proofErr w:type="spellStart"/>
+      <w:r>
+        <w:rPr>
+          <w:rFonts w:ascii="Bahnschrift Light" w:hAnsi="Bahnschrift Light"/>
+        </w:rPr>
+        <w:t>Reset</w:t>
+      </w:r>
+      <w:proofErr w:type="spellEnd"/>
+      <w:r>
+        <w:rPr>
+          <w:rFonts w:ascii="Bahnschrift Light" w:hAnsi="Bahnschrift Light"/>
+        </w:rPr>
+        <w:t xml:space="preserve"> der Alarmanlage, wenn Button 1x gedrückt wird</w:t>
       </w:r>
     </w:p>
     <w:p>
       <w:pPr>
         <w:ind w:firstLine="708"/>
-      </w:pPr>
-      <w:r>
+        <w:rPr>
+          <w:rFonts w:ascii="Bahnschrift Light" w:hAnsi="Bahnschrift Light"/>
+        </w:rPr>
+      </w:pPr>
+      <w:r>
+        <w:rPr>
+          <w:rFonts w:ascii="Bahnschrift Light" w:hAnsi="Bahnschrift Light"/>
+        </w:rPr>
         <w:t>-Deaktivierung der Alarmanlage, wenn Button 2x gedrückt wird</w:t>
       </w:r>
     </w:p>
     <w:p>
-      <w:r>
-        <w:t xml:space="preserve">Funktionale Anforderungen: </w:t>
+      <w:pPr>
+        <w:rPr>
+          <w:rFonts w:ascii="Bahnschrift Light" w:hAnsi="Bahnschrift Light"/>
+        </w:rPr>
+      </w:pPr>
+      <w:r>
+        <w:rPr>
+          <w:rFonts w:ascii="Bahnschrift Light" w:hAnsi="Bahnschrift Light"/>
+          <w:b/>
+          <w:bCs/>
+        </w:rPr>
+        <w:t>Funktionale Anforderungen</w:t>
+      </w:r>
+      <w:r>
+        <w:rPr>
+          <w:rFonts w:ascii="Bahnschrift Light" w:hAnsi="Bahnschrift Light"/>
+        </w:rPr>
+        <w:t xml:space="preserve">: </w:t>
       </w:r>
     </w:p>
     <w:p>
       <w:pPr>
         <w:ind w:firstLine="708"/>
-      </w:pPr>
-      <w:r>
+        <w:rPr>
+          <w:rFonts w:ascii="Bahnschrift Light" w:hAnsi="Bahnschrift Light"/>
+        </w:rPr>
+      </w:pPr>
+      <w:r>
+        <w:rPr>
+          <w:rFonts w:ascii="Bahnschrift Light" w:hAnsi="Bahnschrift Light"/>
+        </w:rPr>
         <w:t>-Bewegungserkennung</w:t>
       </w:r>
     </w:p>
     <w:p>
       <w:pPr>
         <w:ind w:firstLine="708"/>
-      </w:pPr>
-      <w:r>
+        <w:rPr>
+          <w:rFonts w:ascii="Bahnschrift Light" w:hAnsi="Bahnschrift Light"/>
+        </w:rPr>
+      </w:pPr>
+      <w:r>
+        <w:rPr>
+          <w:rFonts w:ascii="Bahnschrift Light" w:hAnsi="Bahnschrift Light"/>
+        </w:rPr>
         <w:t>-Alarmton abspielen</w:t>
       </w:r>
     </w:p>
     <w:p>
       <w:pPr>
         <w:ind w:firstLine="708"/>
-      </w:pPr>
-      <w:r>
+        <w:rPr>
+          <w:rFonts w:ascii="Bahnschrift Light" w:hAnsi="Bahnschrift Light"/>
+        </w:rPr>
+      </w:pPr>
+      <w:r>
+        <w:rPr>
+          <w:rFonts w:ascii="Bahnschrift Light" w:hAnsi="Bahnschrift Light"/>
+        </w:rPr>
         <w:t>-Uhrzeit auf LCD anzeigen</w:t>
       </w:r>
     </w:p>
     <w:p>
-      <w:r>
+      <w:pPr>
+        <w:rPr>
+          <w:rFonts w:ascii="Bahnschrift Light" w:hAnsi="Bahnschrift Light"/>
+          <w:b/>
+          <w:bCs/>
+        </w:rPr>
+      </w:pPr>
+      <w:r>
+        <w:rPr>
+          <w:rFonts w:ascii="Bahnschrift Light" w:hAnsi="Bahnschrift Light"/>
+          <w:b/>
+          <w:bCs/>
+        </w:rPr>
         <w:t>Rahmenbedingungen</w:t>
       </w:r>
-    </w:p>
-    <w:p>
-      <w:r>
+      <w:r>
+        <w:rPr>
+          <w:rFonts w:ascii="Bahnschrift Light" w:hAnsi="Bahnschrift Light"/>
+        </w:rPr>
+        <w:t>:</w:t>
+      </w:r>
+    </w:p>
+    <w:p>
+      <w:pPr>
+        <w:rPr>
+          <w:rFonts w:ascii="Bahnschrift Light" w:hAnsi="Bahnschrift Light"/>
+        </w:rPr>
+      </w:pPr>
+      <w:r>
+        <w:rPr>
+          <w:rFonts w:ascii="Bahnschrift Light" w:hAnsi="Bahnschrift Light"/>
+        </w:rPr>
         <w:tab/>
         <w:t>-Einfache Bedienung</w:t>
       </w:r>
     </w:p>
+    <w:p>
+      <w:pPr>
+        <w:rPr>
+          <w:rFonts w:ascii="Bahnschrift Light" w:hAnsi="Bahnschrift Light"/>
+        </w:rPr>
+      </w:pPr>
+    </w:p>
+    <w:p>
+      <w:pPr>
+        <w:rPr>
+          <w:rFonts w:ascii="Bahnschrift Light" w:hAnsi="Bahnschrift Light"/>
+        </w:rPr>
+      </w:pPr>
+    </w:p>
+    <w:p>
+      <w:pPr>
+        <w:pStyle w:val="berschrift1"/>
+      </w:pPr>
+      <w:r>
+        <w:t>Code</w:t>
+      </w:r>
+    </w:p>
+    <w:p>
+      <w:r>
+        <w:t>https://github.com/Maximilian-Kerskes/Ritnalap</w:t>
+      </w:r>
+    </w:p>
+    <w:p>
+      <w:pPr>
+        <w:rPr>
+          <w:rFonts w:ascii="Bahnschrift Light" w:hAnsi="Bahnschrift Light"/>
+        </w:rPr>
+      </w:pPr>
+    </w:p>
+    <w:p>
+      <w:pPr>
+        <w:rPr>
+          <w:rFonts w:ascii="Bahnschrift Light" w:hAnsi="Bahnschrift Light"/>
+        </w:rPr>
+      </w:pPr>
+    </w:p>
+    <w:p>
+      <w:pPr>
+        <w:rPr>
+          <w:rFonts w:ascii="Bahnschrift Light" w:hAnsi="Bahnschrift Light"/>
+        </w:rPr>
+      </w:pPr>
+    </w:p>
+    <w:p>
+      <w:pPr>
+        <w:rPr>
+          <w:rFonts w:ascii="Bahnschrift Light" w:hAnsi="Bahnschrift Light"/>
+        </w:rPr>
+      </w:pPr>
+    </w:p>
+    <w:p>
+      <w:pPr>
+        <w:rPr>
+          <w:rFonts w:ascii="Bahnschrift Light" w:hAnsi="Bahnschrift Light"/>
+        </w:rPr>
+      </w:pPr>
+    </w:p>
+    <w:p>
+      <w:pPr>
+        <w:rPr>
+          <w:rFonts w:ascii="Bahnschrift Light" w:hAnsi="Bahnschrift Light"/>
+        </w:rPr>
+      </w:pPr>
+    </w:p>
+    <w:p>
+      <w:pPr>
+        <w:rPr>
+          <w:rFonts w:ascii="Bahnschrift Light" w:hAnsi="Bahnschrift Light"/>
+        </w:rPr>
+      </w:pPr>
+    </w:p>
+    <w:p>
+      <w:pPr>
+        <w:pStyle w:val="berschrift2"/>
+        <w:rPr>
+          <w:rFonts w:ascii="Bahnschrift Light" w:hAnsi="Bahnschrift Light"/>
+        </w:rPr>
+      </w:pPr>
+      <w:r>
+        <w:rPr>
+          <w:rFonts w:ascii="Bahnschrift Light" w:hAnsi="Bahnschrift Light"/>
+        </w:rPr>
+        <w:t>Projektplanung</w:t>
+      </w:r>
+    </w:p>
+    <w:p>
+      <w:pPr>
+        <w:rPr>
+          <w:rFonts w:ascii="Bahnschrift Light" w:hAnsi="Bahnschrift Light"/>
+        </w:rPr>
+      </w:pPr>
+      <w:r>
+        <w:rPr>
+          <w:rFonts w:ascii="Bahnschrift Light" w:hAnsi="Bahnschrift Light"/>
+        </w:rPr>
+        <w:t>1. Test der einzelnen Module</w:t>
+      </w:r>
+    </w:p>
+    <w:p>
+      <w:pPr>
+        <w:rPr>
+          <w:rFonts w:ascii="Bahnschrift Light" w:hAnsi="Bahnschrift Light"/>
+        </w:rPr>
+      </w:pPr>
+      <w:r>
+        <w:rPr>
+          <w:rFonts w:ascii="Bahnschrift Light" w:hAnsi="Bahnschrift Light"/>
+        </w:rPr>
+        <w:t>2. Bewegungen erkennen über Sensor</w:t>
+      </w:r>
+    </w:p>
+    <w:p>
+      <w:pPr>
+        <w:rPr>
+          <w:rFonts w:ascii="Bahnschrift Light" w:hAnsi="Bahnschrift Light"/>
+        </w:rPr>
+      </w:pPr>
+      <w:r>
+        <w:rPr>
+          <w:rFonts w:ascii="Bahnschrift Light" w:hAnsi="Bahnschrift Light"/>
+        </w:rPr>
+        <w:t>3. Ton abspielen und Button blinken nach erkennen einer Bewegung</w:t>
+      </w:r>
+    </w:p>
+    <w:p>
+      <w:pPr>
+        <w:rPr>
+          <w:rFonts w:ascii="Bahnschrift Light" w:hAnsi="Bahnschrift Light"/>
+        </w:rPr>
+      </w:pPr>
+      <w:r>
+        <w:rPr>
+          <w:rFonts w:ascii="Bahnschrift Light" w:hAnsi="Bahnschrift Light"/>
+        </w:rPr>
+        <w:t xml:space="preserve">4. </w:t>
+      </w:r>
+      <w:proofErr w:type="spellStart"/>
+      <w:r>
+        <w:rPr>
+          <w:rFonts w:ascii="Bahnschrift Light" w:hAnsi="Bahnschrift Light"/>
+        </w:rPr>
+        <w:t>Reset</w:t>
+      </w:r>
+      <w:proofErr w:type="spellEnd"/>
+      <w:r>
+        <w:rPr>
+          <w:rFonts w:ascii="Bahnschrift Light" w:hAnsi="Bahnschrift Light"/>
+        </w:rPr>
+        <w:t xml:space="preserve"> Alarmanlage</w:t>
+      </w:r>
+    </w:p>
+    <w:p>
+      <w:pPr>
+        <w:rPr>
+          <w:rFonts w:ascii="Bahnschrift Light" w:hAnsi="Bahnschrift Light"/>
+        </w:rPr>
+      </w:pPr>
+      <w:r>
+        <w:rPr>
+          <w:rFonts w:ascii="Bahnschrift Light" w:hAnsi="Bahnschrift Light"/>
+        </w:rPr>
+        <w:t>5. Ausschalten Alarmanlage</w:t>
+      </w:r>
+    </w:p>
+    <w:p>
+      <w:pPr>
+        <w:rPr>
+          <w:rFonts w:ascii="Bahnschrift Light" w:hAnsi="Bahnschrift Light"/>
+        </w:rPr>
+      </w:pPr>
+      <w:r>
+        <w:rPr>
+          <w:rFonts w:ascii="Bahnschrift Light" w:hAnsi="Bahnschrift Light"/>
+        </w:rPr>
+        <w:t>6</w:t>
+      </w:r>
+      <w:r>
+        <w:rPr>
+          <w:rFonts w:ascii="Bahnschrift Light" w:hAnsi="Bahnschrift Light"/>
+        </w:rPr>
+        <w:t>. Aktuelle Uhrzeit auf LCD-Screen anzeigen</w:t>
+      </w:r>
+    </w:p>
+    <w:p>
+      <w:pPr>
+        <w:rPr>
+          <w:rFonts w:ascii="Bahnschrift Light" w:hAnsi="Bahnschrift Light"/>
+        </w:rPr>
+      </w:pPr>
+      <w:r>
+        <w:rPr>
+          <w:rFonts w:ascii="Bahnschrift Light" w:hAnsi="Bahnschrift Light"/>
+        </w:rPr>
+        <w:t>7. Anpassung des Alarmtones an</w:t>
+      </w:r>
+      <w:r>
+        <w:rPr>
+          <w:rFonts w:ascii="Bahnschrift Light" w:hAnsi="Bahnschrift Light"/>
+        </w:rPr>
+        <w:t xml:space="preserve"> d</w:t>
+      </w:r>
+      <w:r>
+        <w:rPr>
+          <w:rFonts w:ascii="Bahnschrift Light" w:hAnsi="Bahnschrift Light"/>
+        </w:rPr>
+        <w:t>ie</w:t>
+      </w:r>
+      <w:r>
+        <w:rPr>
+          <w:rFonts w:ascii="Bahnschrift Light" w:hAnsi="Bahnschrift Light"/>
+        </w:rPr>
+        <w:t xml:space="preserve"> aktuelle Hitsingle „</w:t>
+      </w:r>
+      <w:r>
+        <w:rPr>
+          <w:rFonts w:ascii="Bahnschrift Light" w:hAnsi="Bahnschrift Light"/>
+        </w:rPr>
+        <w:t>Für Elise</w:t>
+      </w:r>
+      <w:r>
+        <w:rPr>
+          <w:rFonts w:ascii="Bahnschrift Light" w:hAnsi="Bahnschrift Light"/>
+        </w:rPr>
+        <w:t xml:space="preserve"> – </w:t>
+      </w:r>
+      <w:r>
+        <w:rPr>
+          <w:rFonts w:ascii="Bahnschrift Light" w:hAnsi="Bahnschrift Light"/>
+        </w:rPr>
+        <w:t>Beethoven“</w:t>
+      </w:r>
+    </w:p>
+    <w:p>
+      <w:pPr>
+        <w:rPr>
+          <w:rFonts w:ascii="Bahnschrift Light" w:hAnsi="Bahnschrift Light"/>
+        </w:rPr>
+      </w:pPr>
+    </w:p>
+    <w:p>
+      <w:pPr>
+        <w:pStyle w:val="berschrift2"/>
+        <w:rPr>
+          <w:rFonts w:ascii="Bahnschrift Light" w:hAnsi="Bahnschrift Light"/>
+        </w:rPr>
+      </w:pPr>
+      <w:r>
+        <w:rPr>
+          <w:rFonts w:ascii="Bahnschrift Light" w:hAnsi="Bahnschrift Light"/>
+        </w:rPr>
+        <w:t>Programmablauf</w:t>
+      </w:r>
+    </w:p>
+    <w:p>
+      <w:pPr>
+        <w:rPr>
+          <w:rFonts w:ascii="Bahnschrift Light" w:hAnsi="Bahnschrift Light"/>
+        </w:rPr>
+      </w:pPr>
+      <w:r>
+        <w:rPr>
+          <w:noProof/>
+        </w:rPr>
+        <w:drawing>
+          <wp:anchor distT="0" distB="0" distL="114300" distR="114300" simplePos="0" relativeHeight="251658240" behindDoc="0" locked="0" layoutInCell="1" allowOverlap="1" wp14:anchorId="367C6E90" wp14:editId="2B6C5340">
+            <wp:simplePos x="902525" y="4073236"/>
+            <wp:positionH relativeFrom="column">
+              <wp:align>left</wp:align>
+            </wp:positionH>
+            <wp:positionV relativeFrom="paragraph">
+              <wp:align>top</wp:align>
+            </wp:positionV>
+            <wp:extent cx="5608955" cy="2865755"/>
+            <wp:effectExtent l="0" t="0" r="0" b="0"/>
+            <wp:wrapSquare wrapText="bothSides"/>
+            <wp:docPr id="588194867" name="Grafik 6"/>
+            <wp:cNvGraphicFramePr>
+              <a:graphicFrameLocks xmlns:a="http://schemas.openxmlformats.org/drawingml/2006/main" noChangeAspect="1"/>
+            </wp:cNvGraphicFramePr>
+            <a:graphic xmlns:a="http://schemas.openxmlformats.org/drawingml/2006/main">
+              <a:graphicData uri="http://schemas.openxmlformats.org/drawingml/2006/picture">
+                <pic:pic xmlns:pic="http://schemas.openxmlformats.org/drawingml/2006/picture">
+                  <pic:nvPicPr>
+                    <pic:cNvPr id="0" name="Picture 14"/>
+                    <pic:cNvPicPr>
+                      <a:picLocks noChangeAspect="1" noChangeArrowheads="1"/>
+                    </pic:cNvPicPr>
+                  </pic:nvPicPr>
+                  <pic:blipFill>
+                    <a:blip r:embed="rId10">
+                      <a:extLst>
+                        <a:ext uri="{28A0092B-C50C-407E-A947-70E740481C1C}">
+                          <a14:useLocalDpi xmlns:a14="http://schemas.microsoft.com/office/drawing/2010/main" val="0"/>
+                        </a:ext>
+                      </a:extLst>
+                    </a:blip>
+                    <a:srcRect/>
+                    <a:stretch>
+                      <a:fillRect/>
+                    </a:stretch>
+                  </pic:blipFill>
+                  <pic:spPr bwMode="auto">
+                    <a:xfrm>
+                      <a:off x="0" y="0"/>
+                      <a:ext cx="5608955" cy="2865755"/>
+                    </a:xfrm>
+                    <a:prstGeom prst="rect">
+                      <a:avLst/>
+                    </a:prstGeom>
+                    <a:noFill/>
+                    <a:ln>
+                      <a:noFill/>
+                    </a:ln>
+                  </pic:spPr>
+                </pic:pic>
+              </a:graphicData>
+            </a:graphic>
+          </wp:anchor>
+        </w:drawing>
+      </w:r>
+    </w:p>
     <w:p/>
+    <w:p>
+      <w:pPr>
+        <w:pStyle w:val="berschrift2"/>
+      </w:pPr>
+      <w:r>
+        <w:lastRenderedPageBreak/>
+        <w:t>Schaltplan</w:t>
+      </w:r>
+    </w:p>
+    <w:p>
+      <w:pPr>
+        <w:pStyle w:val="berschrift2"/>
+      </w:pPr>
+      <w:r>
+        <w:rPr>
+          <w:noProof/>
+        </w:rPr>
+        <w:drawing>
+          <wp:anchor distT="0" distB="0" distL="114300" distR="114300" simplePos="0" relativeHeight="251659264" behindDoc="0" locked="0" layoutInCell="1" allowOverlap="1" wp14:anchorId="0859B364" wp14:editId="7CB2BB05">
+            <wp:simplePos x="0" y="0"/>
+            <wp:positionH relativeFrom="margin">
+              <wp:align>center</wp:align>
+            </wp:positionH>
+            <wp:positionV relativeFrom="paragraph">
+              <wp:posOffset>62230</wp:posOffset>
+            </wp:positionV>
+            <wp:extent cx="4298950" cy="5248910"/>
+            <wp:effectExtent l="0" t="0" r="6350" b="8890"/>
+            <wp:wrapThrough wrapText="bothSides">
+              <wp:wrapPolygon edited="0">
+                <wp:start x="17516" y="0"/>
+                <wp:lineTo x="0" y="235"/>
+                <wp:lineTo x="0" y="13405"/>
+                <wp:lineTo x="10816" y="13797"/>
+                <wp:lineTo x="17516" y="15052"/>
+                <wp:lineTo x="15315" y="15130"/>
+                <wp:lineTo x="14932" y="15287"/>
+                <wp:lineTo x="15027" y="16541"/>
+                <wp:lineTo x="17038" y="17560"/>
+                <wp:lineTo x="17516" y="17560"/>
+                <wp:lineTo x="17516" y="18814"/>
+                <wp:lineTo x="15123" y="19520"/>
+                <wp:lineTo x="15123" y="20931"/>
+                <wp:lineTo x="17516" y="21323"/>
+                <wp:lineTo x="17516" y="21558"/>
+                <wp:lineTo x="21536" y="21558"/>
+                <wp:lineTo x="21536" y="14816"/>
+                <wp:lineTo x="10720" y="13797"/>
+                <wp:lineTo x="4116" y="12543"/>
+                <wp:lineTo x="21536" y="12229"/>
+                <wp:lineTo x="21536" y="5409"/>
+                <wp:lineTo x="6317" y="5017"/>
+                <wp:lineTo x="4116" y="3763"/>
+                <wp:lineTo x="21536" y="3214"/>
+                <wp:lineTo x="21536" y="0"/>
+                <wp:lineTo x="17516" y="0"/>
+              </wp:wrapPolygon>
+            </wp:wrapThrough>
+            <wp:docPr id="5376728" name="Grafik 1"/>
+            <wp:cNvGraphicFramePr>
+              <a:graphicFrameLocks xmlns:a="http://schemas.openxmlformats.org/drawingml/2006/main" noChangeAspect="1"/>
+            </wp:cNvGraphicFramePr>
+            <a:graphic xmlns:a="http://schemas.openxmlformats.org/drawingml/2006/main">
+              <a:graphicData uri="http://schemas.openxmlformats.org/drawingml/2006/picture">
+                <pic:pic xmlns:pic="http://schemas.openxmlformats.org/drawingml/2006/picture">
+                  <pic:nvPicPr>
+                    <pic:cNvPr id="0" name="Picture 1"/>
+                    <pic:cNvPicPr>
+                      <a:picLocks noChangeAspect="1" noChangeArrowheads="1"/>
+                    </pic:cNvPicPr>
+                  </pic:nvPicPr>
+                  <pic:blipFill>
+                    <a:blip r:embed="rId11">
+                      <a:extLst>
+                        <a:ext uri="{28A0092B-C50C-407E-A947-70E740481C1C}">
+                          <a14:useLocalDpi xmlns:a14="http://schemas.microsoft.com/office/drawing/2010/main" val="0"/>
+                        </a:ext>
+                      </a:extLst>
+                    </a:blip>
+                    <a:srcRect/>
+                    <a:stretch>
+                      <a:fillRect/>
+                    </a:stretch>
+                  </pic:blipFill>
+                  <pic:spPr bwMode="auto">
+                    <a:xfrm>
+                      <a:off x="0" y="0"/>
+                      <a:ext cx="4298950" cy="5248910"/>
+                    </a:xfrm>
+                    <a:prstGeom prst="rect">
+                      <a:avLst/>
+                    </a:prstGeom>
+                    <a:noFill/>
+                    <a:ln>
+                      <a:noFill/>
+                    </a:ln>
+                  </pic:spPr>
+                </pic:pic>
+              </a:graphicData>
+            </a:graphic>
+          </wp:anchor>
+        </w:drawing>
+      </w:r>
+    </w:p>
+    <w:p>
+      <w:pPr>
+        <w:pStyle w:val="berschrift2"/>
+      </w:pPr>
+    </w:p>
+    <w:p>
+      <w:pPr>
+        <w:pStyle w:val="berschrift2"/>
+      </w:pPr>
+    </w:p>
+    <w:p>
+      <w:pPr>
+        <w:pStyle w:val="berschrift2"/>
+      </w:pPr>
+    </w:p>
+    <w:p>
+      <w:pPr>
+        <w:pStyle w:val="berschrift2"/>
+      </w:pPr>
+    </w:p>
+    <w:p>
+      <w:pPr>
+        <w:pStyle w:val="berschrift2"/>
+      </w:pPr>
+    </w:p>
+    <w:p>
+      <w:pPr>
+        <w:pStyle w:val="berschrift2"/>
+      </w:pPr>
+    </w:p>
+    <w:p>
+      <w:pPr>
+        <w:pStyle w:val="berschrift2"/>
+      </w:pPr>
+    </w:p>
+    <w:p>
+      <w:pPr>
+        <w:pStyle w:val="berschrift2"/>
+      </w:pPr>
+    </w:p>
+    <w:p>
+      <w:pPr>
+        <w:pStyle w:val="berschrift2"/>
+      </w:pPr>
+    </w:p>
+    <w:p>
+      <w:pPr>
+        <w:pStyle w:val="berschrift2"/>
+      </w:pPr>
+    </w:p>
+    <w:p>
+      <w:pPr>
+        <w:pStyle w:val="berschrift2"/>
+      </w:pPr>
+    </w:p>
+    <w:p>
+      <w:pPr>
+        <w:pStyle w:val="berschrift2"/>
+      </w:pPr>
+    </w:p>
+    <w:p>
+      <w:pPr>
+        <w:pStyle w:val="berschrift2"/>
+      </w:pPr>
+    </w:p>
+    <w:p>
+      <w:pPr>
+        <w:pStyle w:val="berschrift2"/>
+      </w:pPr>
+    </w:p>
+    <w:p>
+      <w:r>
+        <w:t xml:space="preserve">Info zum Schaltplan: Wir hatten kein </w:t>
+      </w:r>
+      <w:proofErr w:type="spellStart"/>
+      <w:r>
+        <w:t>Pinout</w:t>
+      </w:r>
+      <w:proofErr w:type="spellEnd"/>
+      <w:r>
+        <w:t xml:space="preserve"> für den Buzzer gefunden weswegen der im Schaltplan leider fehlt.</w:t>
+      </w:r>
+    </w:p>
     <w:p/>
-    <w:p/>
-    <w:p/>
-    <w:p>
-      <w:r>
-        <w:t>Projektplanung: 1. Test der einzelnen Module</w:t>
-      </w:r>
-    </w:p>
-    <w:p>
-      <w:r>
-        <w:tab/>
-      </w:r>
-      <w:r>
-        <w:tab/>
-        <w:t xml:space="preserve"> 2. Bewegungen erkennen über Sensor</w:t>
-      </w:r>
-    </w:p>
-    <w:p>
-      <w:r>
-        <w:tab/>
-      </w:r>
-      <w:r>
-        <w:tab/>
-        <w:t xml:space="preserve"> 3. Ton abspielen und Button blinken nach erkennen einer Bewegung</w:t>
-      </w:r>
-    </w:p>
-    <w:p>
-      <w:r>
-        <w:tab/>
-      </w:r>
-      <w:r>
-        <w:tab/>
-        <w:t xml:space="preserve"> 4. Reset Alarmanlage</w:t>
-      </w:r>
-    </w:p>
-    <w:p>
-      <w:r>
-        <w:tab/>
-      </w:r>
-      <w:r>
-        <w:tab/>
-        <w:t xml:space="preserve"> 5. Ausschalten Alarmanlage</w:t>
-      </w:r>
-    </w:p>
-    <w:p>
-      <w:r>
-        <w:tab/>
-      </w:r>
-      <w:r>
-        <w:tab/>
-        <w:t xml:space="preserve"> </w:t>
-      </w:r>
-      <w:r>
-        <w:t>6</w:t>
-      </w:r>
-      <w:r>
-        <w:t>. Aktuelle Uhrzeit auf LCD-Screen anzeigen</w:t>
-      </w:r>
-    </w:p>
-    <w:p/>
-    <w:p/>
+    <w:p>
+      <w:pPr>
+        <w:pStyle w:val="berschrift2"/>
+      </w:pPr>
+      <w:r>
+        <w:t>Abnahmeprotokoll</w:t>
+      </w:r>
+    </w:p>
+    <w:p>
+      <w:pPr>
+        <w:rPr>
+          <w:rFonts w:ascii="Bahnschrift Light" w:hAnsi="Bahnschrift Light"/>
+        </w:rPr>
+      </w:pPr>
+      <w:r>
+        <w:rPr>
+          <w:rFonts w:ascii="Bahnschrift Light" w:hAnsi="Bahnschrift Light"/>
+        </w:rPr>
+        <w:t>Balingen, 03.03.2026 11:30</w:t>
+      </w:r>
+    </w:p>
+    <w:p>
+      <w:pPr>
+        <w:rPr>
+          <w:rFonts w:ascii="Bahnschrift Light" w:hAnsi="Bahnschrift Light"/>
+        </w:rPr>
+      </w:pPr>
+      <w:r>
+        <w:rPr>
+          <w:rFonts w:ascii="Bahnschrift Light" w:hAnsi="Bahnschrift Light"/>
+        </w:rPr>
+        <w:t>Prüfer: Herr Dieringer</w:t>
+      </w:r>
+    </w:p>
+    <w:p>
+      <w:pPr>
+        <w:rPr>
+          <w:rFonts w:ascii="Bahnschrift Light" w:hAnsi="Bahnschrift Light"/>
+        </w:rPr>
+      </w:pPr>
+      <w:r>
+        <w:rPr>
+          <w:rFonts w:ascii="Bahnschrift Light" w:hAnsi="Bahnschrift Light"/>
+        </w:rPr>
+        <w:t>Entwickler: Maximilian Kerskes, Johannes Schambortzki</w:t>
+      </w:r>
+    </w:p>
+    <w:p>
+      <w:pPr>
+        <w:rPr>
+          <w:rFonts w:ascii="Bahnschrift Light" w:hAnsi="Bahnschrift Light"/>
+        </w:rPr>
+      </w:pPr>
+      <w:r>
+        <w:rPr>
+          <w:rFonts w:ascii="Bahnschrift Light" w:hAnsi="Bahnschrift Light"/>
+        </w:rPr>
+        <w:t>Zuschauer: Klasse E3FI1 AE</w:t>
+      </w:r>
+    </w:p>
+    <w:p>
+      <w:pPr>
+        <w:rPr>
+          <w:rFonts w:ascii="Bahnschrift Light" w:hAnsi="Bahnschrift Light"/>
+        </w:rPr>
+      </w:pPr>
+      <w:r>
+        <w:rPr>
+          <w:rFonts w:ascii="Bahnschrift Light" w:hAnsi="Bahnschrift Light"/>
+        </w:rPr>
+        <w:t>Ergebnis der Prüfung: Alle Funktionen erfolgreich getestet</w:t>
+      </w:r>
+    </w:p>
+    <w:p>
+      <w:pPr>
+        <w:rPr>
+          <w:rFonts w:ascii="Bahnschrift Light" w:hAnsi="Bahnschrift Light"/>
+        </w:rPr>
+      </w:pPr>
+      <w:r>
+        <w:rPr>
+          <w:rFonts w:ascii="Bahnschrift Light" w:hAnsi="Bahnschrift Light"/>
+        </w:rPr>
+        <w:t>Abnahme Erfolgreich: Ja</w:t>
+      </w:r>
+    </w:p>
+    <w:p>
+      <w:pPr>
+        <w:rPr>
+          <w:rFonts w:ascii="Bahnschrift Light" w:hAnsi="Bahnschrift Light"/>
+        </w:rPr>
+      </w:pPr>
+      <w:r>
+        <w:rPr>
+          <w:rFonts w:ascii="Bahnschrift Light" w:hAnsi="Bahnschrift Light"/>
+        </w:rPr>
+        <w:br w:type="textWrapping" w:clear="all"/>
+      </w:r>
+    </w:p>
     <w:sectPr>
       <w:pgSz w:w="11906" w:h="16838"/>
       <w:pgMar w:top="1417" w:right="1417" w:bottom="1134" w:left="1417" w:header="708" w:footer="708" w:gutter="0"/>
@@ -293,6 +1411,126 @@
     </w:sectPr>
   </w:body>
 </w:document>
+</file>
+
+<file path=word/numbering.xml><?xml version="1.0" encoding="utf-8"?>
+<w:numbering xmlns:wpc="http://schemas.microsoft.com/office/word/2010/wordprocessingCanvas" xmlns:cx="http://schemas.microsoft.com/office/drawing/2014/chartex" xmlns:cx1="http://schemas.microsoft.com/office/drawing/2015/9/8/chartex" xmlns:cx2="http://schemas.microsoft.com/office/drawing/2015/10/21/chartex" xmlns:cx3="http://schemas.microsoft.com/office/drawing/2016/5/9/chartex" xmlns:cx4="http://schemas.microsoft.com/office/drawing/2016/5/10/chartex" xmlns:cx5="http://schemas.microsoft.com/office/drawing/2016/5/11/chartex" xmlns:cx6="http://schemas.microsoft.com/office/drawing/2016/5/12/chartex" xmlns:cx7="http://schemas.microsoft.com/office/drawing/2016/5/13/chartex" xmlns:cx8="http://schemas.microsoft.com/office/drawing/2016/5/14/chartex" xmlns:mc="http://schemas.openxmlformats.org/markup-compatibility/2006" xmlns:aink="http://schemas.microsoft.com/office/drawing/2016/ink" xmlns:am3d="http://schemas.microsoft.com/office/drawing/2017/model3d" xmlns:o="urn:schemas-microsoft-com:office:office" xmlns:oel="http://schemas.microsoft.com/office/2019/extlst" xmlns:r="http://schemas.openxmlformats.org/officeDocument/2006/relationships" xmlns:m="http://schemas.openxmlformats.org/officeDocument/2006/math" xmlns:v="urn:schemas-microsoft-com:vml" xmlns:wp14="http://schemas.microsoft.com/office/word/2010/wordprocessingDrawing" xmlns:wp="http://schemas.openxmlformats.org/drawingml/2006/wordprocessingDrawing" xmlns:w10="urn:schemas-microsoft-com:office:word" xmlns:w="http://schemas.openxmlformats.org/wordprocessingml/2006/main" xmlns:w14="http://schemas.microsoft.com/office/word/2010/wordml" xmlns:w15="http://schemas.microsoft.com/office/word/2012/wordml" xmlns:w16cex="http://schemas.microsoft.com/office/word/2018/wordml/cex" xmlns:w16cid="http://schemas.microsoft.com/office/word/2016/wordml/cid" xmlns:w16="http://schemas.microsoft.com/office/word/2018/wordml" xmlns:w16du="http://schemas.microsoft.com/office/word/2023/wordml/word16du" xmlns:w16sdtdh="http://schemas.microsoft.com/office/word/2020/wordml/sdtdatahash" xmlns:w16sdtfl="http://schemas.microsoft.com/office/word/2024/wordml/sdtformatlock" xmlns:w16se="http://schemas.microsoft.com/office/word/2015/wordml/symex" xmlns:wpg="http://schemas.microsoft.com/office/word/2010/wordprocessingGroup" xmlns:wpi="http://schemas.microsoft.com/office/word/2010/wordprocessingInk" xmlns:wne="http://schemas.microsoft.com/office/word/2006/wordml" xmlns:wps="http://schemas.microsoft.com/office/word/2010/wordprocessingShape" mc:Ignorable="w14 w15 w16se w16cid w16 w16cex w16sdtdh w16sdtfl w16du wp14">
+  <w:abstractNum w:abstractNumId="0" w15:restartNumberingAfterBreak="0">
+    <w:nsid w:val="613876C3"/>
+    <w:multiLevelType w:val="hybridMultilevel"/>
+    <w:tmpl w:val="430A363C"/>
+    <w:lvl w:ilvl="0" w:tplc="E3EEA20C">
+      <w:numFmt w:val="bullet"/>
+      <w:lvlText w:val=""/>
+      <w:lvlJc w:val="left"/>
+      <w:pPr>
+        <w:ind w:left="720" w:hanging="360"/>
+      </w:pPr>
+      <w:rPr>
+        <w:rFonts w:ascii="Symbol" w:eastAsiaTheme="minorHAnsi" w:hAnsi="Symbol" w:cstheme="minorBidi" w:hint="default"/>
+      </w:rPr>
+    </w:lvl>
+    <w:lvl w:ilvl="1" w:tplc="04070003" w:tentative="1">
+      <w:start w:val="1"/>
+      <w:numFmt w:val="bullet"/>
+      <w:lvlText w:val="o"/>
+      <w:lvlJc w:val="left"/>
+      <w:pPr>
+        <w:ind w:left="1440" w:hanging="360"/>
+      </w:pPr>
+      <w:rPr>
+        <w:rFonts w:ascii="Courier New" w:hAnsi="Courier New" w:cs="Courier New" w:hint="default"/>
+      </w:rPr>
+    </w:lvl>
+    <w:lvl w:ilvl="2" w:tplc="04070005" w:tentative="1">
+      <w:start w:val="1"/>
+      <w:numFmt w:val="bullet"/>
+      <w:lvlText w:val=""/>
+      <w:lvlJc w:val="left"/>
+      <w:pPr>
+        <w:ind w:left="2160" w:hanging="360"/>
+      </w:pPr>
+      <w:rPr>
+        <w:rFonts w:ascii="Wingdings" w:hAnsi="Wingdings" w:hint="default"/>
+      </w:rPr>
+    </w:lvl>
+    <w:lvl w:ilvl="3" w:tplc="04070001" w:tentative="1">
+      <w:start w:val="1"/>
+      <w:numFmt w:val="bullet"/>
+      <w:lvlText w:val=""/>
+      <w:lvlJc w:val="left"/>
+      <w:pPr>
+        <w:ind w:left="2880" w:hanging="360"/>
+      </w:pPr>
+      <w:rPr>
+        <w:rFonts w:ascii="Symbol" w:hAnsi="Symbol" w:hint="default"/>
+      </w:rPr>
+    </w:lvl>
+    <w:lvl w:ilvl="4" w:tplc="04070003" w:tentative="1">
+      <w:start w:val="1"/>
+      <w:numFmt w:val="bullet"/>
+      <w:lvlText w:val="o"/>
+      <w:lvlJc w:val="left"/>
+      <w:pPr>
+        <w:ind w:left="3600" w:hanging="360"/>
+      </w:pPr>
+      <w:rPr>
+        <w:rFonts w:ascii="Courier New" w:hAnsi="Courier New" w:cs="Courier New" w:hint="default"/>
+      </w:rPr>
+    </w:lvl>
+    <w:lvl w:ilvl="5" w:tplc="04070005" w:tentative="1">
+      <w:start w:val="1"/>
+      <w:numFmt w:val="bullet"/>
+      <w:lvlText w:val=""/>
+      <w:lvlJc w:val="left"/>
+      <w:pPr>
+        <w:ind w:left="4320" w:hanging="360"/>
+      </w:pPr>
+      <w:rPr>
+        <w:rFonts w:ascii="Wingdings" w:hAnsi="Wingdings" w:hint="default"/>
+      </w:rPr>
+    </w:lvl>
+    <w:lvl w:ilvl="6" w:tplc="04070001" w:tentative="1">
+      <w:start w:val="1"/>
+      <w:numFmt w:val="bullet"/>
+      <w:lvlText w:val=""/>
+      <w:lvlJc w:val="left"/>
+      <w:pPr>
+        <w:ind w:left="5040" w:hanging="360"/>
+      </w:pPr>
+      <w:rPr>
+        <w:rFonts w:ascii="Symbol" w:hAnsi="Symbol" w:hint="default"/>
+      </w:rPr>
+    </w:lvl>
+    <w:lvl w:ilvl="7" w:tplc="04070003" w:tentative="1">
+      <w:start w:val="1"/>
+      <w:numFmt w:val="bullet"/>
+      <w:lvlText w:val="o"/>
+      <w:lvlJc w:val="left"/>
+      <w:pPr>
+        <w:ind w:left="5760" w:hanging="360"/>
+      </w:pPr>
+      <w:rPr>
+        <w:rFonts w:ascii="Courier New" w:hAnsi="Courier New" w:cs="Courier New" w:hint="default"/>
+      </w:rPr>
+    </w:lvl>
+    <w:lvl w:ilvl="8" w:tplc="04070005" w:tentative="1">
+      <w:start w:val="1"/>
+      <w:numFmt w:val="bullet"/>
+      <w:lvlText w:val=""/>
+      <w:lvlJc w:val="left"/>
+      <w:pPr>
+        <w:ind w:left="6480" w:hanging="360"/>
+      </w:pPr>
+      <w:rPr>
+        <w:rFonts w:ascii="Wingdings" w:hAnsi="Wingdings" w:hint="default"/>
+      </w:rPr>
+    </w:lvl>
+  </w:abstractNum>
+  <w:num w:numId="1" w16cid:durableId="1954633549">
+    <w:abstractNumId w:val="0"/>
+  </w:num>
+</w:numbering>
 </file>
 
 <file path=word/styles.xml><?xml version="1.0" encoding="utf-8"?>
@@ -723,7 +1961,6 @@
     <w:next w:val="Standard"/>
     <w:link w:val="berschrift2Zchn"/>
     <w:uiPriority w:val="9"/>
-    <w:semiHidden/>
     <w:unhideWhenUsed/>
     <w:qFormat/>
     <w:rsid w:val="005300DD"/>
@@ -746,7 +1983,6 @@
     <w:next w:val="Standard"/>
     <w:link w:val="berschrift3Zchn"/>
     <w:uiPriority w:val="9"/>
-    <w:semiHidden/>
     <w:unhideWhenUsed/>
     <w:qFormat/>
     <w:rsid w:val="005300DD"/>
@@ -940,7 +2176,6 @@
     <w:basedOn w:val="Absatz-Standardschriftart"/>
     <w:link w:val="berschrift2"/>
     <w:uiPriority w:val="9"/>
-    <w:semiHidden/>
     <w:rsid w:val="005300DD"/>
     <w:rPr>
       <w:rFonts w:asciiTheme="majorHAnsi" w:eastAsiaTheme="majorEastAsia" w:hAnsiTheme="majorHAnsi" w:cstheme="majorBidi"/>
@@ -954,7 +2189,6 @@
     <w:basedOn w:val="Absatz-Standardschriftart"/>
     <w:link w:val="berschrift3"/>
     <w:uiPriority w:val="9"/>
-    <w:semiHidden/>
     <w:rsid w:val="005300DD"/>
     <w:rPr>
       <w:rFonts w:eastAsiaTheme="majorEastAsia" w:cstheme="majorBidi"/>

</xml_diff>